<commit_message>
Section 7: rename to Analytical Journey, evidence-led professional tone
</commit_message>
<xml_diff>
--- a/credit_model_risk_audit_toolkit/docs/Model_Documentation_v3.docx
+++ b/credit_model_risk_audit_toolkit/docs/Model_Documentation_v3.docx
@@ -7698,7 +7698,7 @@
           <w:sz w:val="30"/>
           <w:szCs w:val="30"/>
         </w:rPr>
-        <w:t xml:space="preserve">7. Analytical Journey and Principal Investigator Contribution</w:t>
+        <w:t xml:space="preserve">7. Analytical Journey</w:t>
       </w:r>
     </w:p>
     <w:p>
@@ -7711,7 +7711,7 @@
           <w:sz w:val="21"/>
           <w:szCs w:val="21"/>
         </w:rPr>
-        <w:t xml:space="preserve">This section documents the investigative process that produced the toolkit's findings. The analysis was not executed from a predetermined specification — it evolved through iterative empirical challenge, with each finding driving the next question.</w:t>
+        <w:t xml:space="preserve">This section documents the analytical journey that produced the toolkit’s findings. The work was not executed from a predetermined specification — each step was driven by what the data and diagnostics showed, with findings shaping the next question.</w:t>
       </w:r>
     </w:p>
     <w:p>
@@ -7739,7 +7739,7 @@
           <w:sz w:val="21"/>
           <w:szCs w:val="21"/>
         </w:rPr>
-        <w:t xml:space="preserve">14-feature XGBoost model with SMOTE oversampling, standard 80/20 random split. Initial audit scorecard: A=GREEN, B=AMBER, C=RED, D=AMBER.</w:t>
+        <w:t xml:space="preserve">14-feature XGBoost model with SMOTE oversampling and a standard random split. Initial audit scorecard: A=GREEN, B=AMBER, C=RED, D=AMBER. Each subsequent step was driven by what the data and diagnostics showed, not by a predetermined conclusion.</w:t>
       </w:r>
     </w:p>
     <w:p>
@@ -7759,7 +7759,7 @@
           <w:sz w:val="21"/>
           <w:szCs w:val="21"/>
         </w:rPr>
-        <w:t xml:space="preserve">First challenge: data leakage screen: </w:t>
+        <w:t xml:space="preserve">Feature selection and imputation review: </w:t>
       </w:r>
       <w:r>
         <w:rPr>
@@ -7767,7 +7767,7 @@
           <w:sz w:val="21"/>
           <w:szCs w:val="21"/>
         </w:rPr>
-        <w:t xml:space="preserve">Screened all 64 UCI features for point-biserial correlation with target. Curated 14 features removing leakage candidates. Replaced SMOTE with native scale_pos_weight — SMOTE distorts the feature distribution that SHAP measures.</w:t>
+        <w:t xml:space="preserve">Screening all 64 UCI features for point-biserial correlation flagged several as leakage-prone. The feature set was reduced to 14 curated ratios with clear economic interpretation. SMOTE was replaced with native scale_pos_weight after recognising that synthetic oversampling distorts the feature distributions that SHAP is subsequently asked to explain — an inconsistency that would undermine the audit layer.</w:t>
       </w:r>
     </w:p>
     <w:p>
@@ -7787,7 +7787,7 @@
           <w:sz w:val="21"/>
           <w:szCs w:val="21"/>
         </w:rPr>
-        <w:t xml:space="preserve">Second challenge: temporal validity: </w:t>
+        <w:t xml:space="preserve">Partitioning review: </w:t>
       </w:r>
       <w:r>
         <w:rPr>
@@ -7795,7 +7795,7 @@
           <w:sz w:val="21"/>
           <w:szCs w:val="21"/>
         </w:rPr>
-        <w:t xml:space="preserve">Recognised that a random 80/20 split on cross-sectional data cannot constitute an out-of-time test. Constructed pseudo-OOT via composite distress score, producing a stressed holdout (18.1% bankrupt) that tests the model under adverse conditions.</w:t>
+        <w:t xml:space="preserve">A random 80/20 split on cross-sectional data does not constitute a meaningful out-of-time test. A composite distress score was used to construct a pseudo-OOT partition concentrating stressed firms in the holdout (18.1% bankrupt rate), more closely approximating the conditions under which the model would be challenged in practice.</w:t>
       </w:r>
     </w:p>
     <w:p>
@@ -7815,7 +7815,7 @@
           <w:sz w:val="21"/>
           <w:szCs w:val="21"/>
         </w:rPr>
-        <w:t xml:space="preserve">Third challenge: model complexity: </w:t>
+        <w:t xml:space="preserve">Complexity review: </w:t>
       </w:r>
       <w:r>
         <w:rPr>
@@ -7823,7 +7823,7 @@
           <w:sz w:val="21"/>
           <w:szCs w:val="21"/>
         </w:rPr>
-        <w:t xml:space="preserve">Asked: why 400 trees? Ran ablation across 5-600 trees and 3-14 features. Finding: 150 trees and 7 features deliver 99%+ of performance. 400 trees is over-specified but not overfit.</w:t>
+        <w:t xml:space="preserve">The initial specification of 400 trees warranted examination. An ablation across tree counts and feature sets showed that 150 trees and 7 features recover 99%+ of discriminatory performance. The additional complexity was not contributing meaningful signal — relevant for a model that would need to be explained to a credit risk committee.</w:t>
       </w:r>
     </w:p>
     <w:p>
@@ -7843,7 +7843,7 @@
           <w:sz w:val="21"/>
           <w:szCs w:val="21"/>
         </w:rPr>
-        <w:t xml:space="preserve">Fourth challenge: model selection: </w:t>
+        <w:t xml:space="preserve">Model selection: </w:t>
       </w:r>
       <w:r>
         <w:rPr>
@@ -7851,7 +7851,7 @@
           <w:sz w:val="21"/>
           <w:szCs w:val="21"/>
         </w:rPr>
-        <w:t xml:space="preserve">Refused to select LR over XGBoost on interpretability grounds alone. Ran full formal test suite: asymmetric loss function, Brier/Log-Loss, Wilcoxon significance tests, calibration analysis. Data selected LR at all industry-standard cost ratios. Model selection documented with regulatory alignment.</w:t>
+        <w:t xml:space="preserve">Interpretability alone is not a sufficient basis for model selection in a governance context. A formal test suite was run across four independent dimensions: asymmetric credit loss function, proper scoring rules, cross-validated significance testing, and calibration analysis. The data selected Logistic Regression at all industry-standard cost ratios. The switch was documented with full evidence rather than asserted.</w:t>
       </w:r>
     </w:p>
     <w:p>
@@ -7871,7 +7871,7 @@
           <w:sz w:val="21"/>
           <w:szCs w:val="21"/>
         </w:rPr>
-        <w:t xml:space="preserve">Fifth challenge: which features matter?: </w:t>
+        <w:t xml:space="preserve">Feature importance and parsimony: </w:t>
       </w:r>
       <w:r>
         <w:rPr>
@@ -7879,7 +7879,7 @@
           <w:sz w:val="21"/>
           <w:szCs w:val="21"/>
         </w:rPr>
-        <w:t xml:space="preserve">Extracted LR coefficients and XGBoost SHAP importances. Observed rho=0.93 agreement. Ran feature ablation across 8 configurations. Identified 7-feature parsimonious optimum. Characterised the 9 additional false negatives created by feature reduction — all had adverse X2 or X6 that the top-5 liquidity features could not detect.</w:t>
+        <w:t xml:space="preserve">Comparing LR coefficients and XGBoost SHAP importances produced an unexpected result — rho=0.93 agreement between the two independent methods. This was not the starting hypothesis; it emerged from the analysis. An ablation across 8 feature configurations identified a 7-feature specification retaining 99.9% of discriminatory power. Tracing the firms newly missed by the reduced set confirmed that adverse leverage (X2) and negative retained earnings (X6) are essential additions to the top-5 liquidity ratios.</w:t>
       </w:r>
     </w:p>
     <w:p>
@@ -7899,7 +7899,7 @@
           <w:sz w:val="21"/>
           <w:szCs w:val="21"/>
         </w:rPr>
-        <w:t xml:space="preserve">Sixth challenge: false negative anatomy: </w:t>
+        <w:t xml:space="preserve">False negative review: </w:t>
       </w:r>
       <w:r>
         <w:rPr>
@@ -7907,7 +7907,7 @@
           <w:sz w:val="21"/>
           <w:szCs w:val="21"/>
         </w:rPr>
-        <w:t xml:space="preserve">Traced each of the 26 LR-only catches vs XGBoost to their root cause: XGBoost's non-linear tree routing finds partial protective signals in present ratios, missing the cumulative adverse signal that LR accumulates linearly. This is a structural advantage of LR for early-stage distress.</w:t>
+        <w:t xml:space="preserve">Rather than accepting the FN counts at face value, each of the 26 firms caught by LR but missed by XGBoost was examined. XGBoost's tree routing found partial protective signals and routed these firms to low-risk leaves. LR's linear accumulation of adverse signals caught the cumulative picture. This is the expected behaviour of a non-linear model on near-linear data, and it reinforced the model selection decision.</w:t>
       </w:r>
     </w:p>
     <w:p>
@@ -7935,7 +7935,7 @@
           <w:sz w:val="21"/>
           <w:szCs w:val="21"/>
         </w:rPr>
-        <w:t xml:space="preserve">SHAP agrees with LR. This is not a coincidence — it is evidence that the data is near-linearly separable and that XGBoost's complexity is unjustified. The finding reframes the entire toolkit: SHAP is not decoration. It is the mechanism that made this discovery possible.</w:t>
+        <w:t xml:space="preserve">The rho=0.93 SHAP-LR agreement tied everything together. It confirmed that the credit relationships in this dataset are near-linearly separable, that XGBoost was approximating a linear function with unnecessary complexity, and — critically — that the SHAP explanations are substantive rather than cosmetic. SHAP is not decoration. It is the mechanism that surfaced this finding and the mechanism by which SR 11-7 independent challenge, EU AI Act Art.13 transparency, and PRA SS1/23 behavioural monitoring can be discharged if a non-linear model is deployed.</w:t>
       </w:r>
     </w:p>
     <w:p>

</xml_diff>